<commit_message>
Actualización general de Documentación
</commit_message>
<xml_diff>
--- a/Fase 2/Evidencias Proyecto/Evidencias de Documentación/Acta de Constitución CuTuCo.docx
+++ b/Fase 2/Evidencias Proyecto/Evidencias de Documentación/Acta de Constitución CuTuCo.docx
@@ -25,7 +25,7 @@
           <w:sz w:val="48"/>
           <w:szCs w:val="48"/>
         </w:rPr>
-        <w:t>Acta de Constitucion del Proyecto</w:t>
+        <w:t>Acta de Constitución del Proyecto</w:t>
       </w:r>
     </w:p>
     <w:p>
@@ -139,7 +139,7 @@
                 <w:rFonts w:asciiTheme="majorHAnsi" w:hAnsiTheme="majorHAnsi" w:cstheme="majorHAnsi"/>
                 <w:sz w:val="17"/>
               </w:rPr>
-              <w:t>Duoc UC Plaza Norte / Ingenieria en Informatica</w:t>
+              <w:t>Duoc UC Plaza Norte / Ingeniería en Informática</w:t>
             </w:r>
           </w:p>
         </w:tc>
@@ -313,7 +313,7 @@
                 <w:rFonts w:asciiTheme="majorHAnsi" w:hAnsiTheme="majorHAnsi" w:cstheme="majorHAnsi"/>
                 <w:sz w:val="17"/>
               </w:rPr>
-              <w:t>Proyecto academico Capstone de Duoc UC Plaza Norte</w:t>
+              <w:t>Productores AFC/Locales</w:t>
             </w:r>
           </w:p>
         </w:tc>
@@ -371,14 +371,7 @@
                 <w:rFonts w:asciiTheme="majorHAnsi" w:hAnsiTheme="majorHAnsi" w:cstheme="majorHAnsi"/>
                 <w:sz w:val="17"/>
               </w:rPr>
-              <w:t>Patrocinio academico de la asignatura</w:t>
-            </w:r>
-            <w:r>
-              <w:rPr>
-                <w:rFonts w:asciiTheme="majorHAnsi" w:hAnsiTheme="majorHAnsi" w:cstheme="majorHAnsi"/>
-                <w:sz w:val="17"/>
-              </w:rPr>
-              <w:t xml:space="preserve"> Duoc UC</w:t>
+              <w:t>Patrocinio académico de la asignatura Duoc UC</w:t>
             </w:r>
           </w:p>
         </w:tc>
@@ -436,7 +429,7 @@
                 <w:rFonts w:asciiTheme="majorHAnsi" w:hAnsiTheme="majorHAnsi" w:cstheme="majorHAnsi"/>
                 <w:sz w:val="17"/>
               </w:rPr>
-              <w:t>Asumimos la direccion del proyecto entre los dos integrantes y repartimos las responsabilidades principales entre backend y frontend. Vicente Rivera mantiene el rol formal de Jefe de Proyecto y lidera backend; Ignacio Fuenzalida lidera frontend. La arquitectura, las pruebas, la documentacion, el control de cambios y la coordinacion se mantienen como responsabilidades compartidas.</w:t>
+              <w:t>Asumimos la dirección del proyecto entre los dos integrantes y repartimos las responsabilidades principales entre backend y frontend. Vicente Rivera (con responsabilidades compartidas con Ignacio Fuenzalida en actividades y entregables) mantiene el rol formal de Jefe de Proyecto y lidera backend; Ignacio Fuenzalida lidera frontend. La arquitectura, las pruebas, la documentación, el control de cambios y la coordinación se mantienen como responsabilidades compartidas.</w:t>
             </w:r>
           </w:p>
         </w:tc>
@@ -511,7 +504,7 @@
                 <w:rFonts w:asciiTheme="majorHAnsi" w:hAnsiTheme="majorHAnsi" w:cstheme="majorHAnsi"/>
                 <w:sz w:val="17"/>
               </w:rPr>
-              <w:t>Desarrollamos CuTuCo para responder a la brecha tecnologica que tienen pequenos y medianos productores locales para vender por internet y a la intermediacion comercial que reduce su margen. Nuestra propuesta es un Marketplace SaaS B2B2C de comercio de proximidad que conecta de manera directa a productores con compradores y comercios locales, sin exigir que cada productor mantenga una tienda digital independiente.</w:t>
+              <w:t>Desarrollamos CuTuCo para responder a la brecha tecnológica que tienen pequeños y medianos productores locales para vender por internet y a la intermediación comercial que reduce su margen. Nuestra propuesta es un Marketplace SaaS B2B2C de comercio de proximidad que conecta de manera directa a productores con compradores y comercios locales, sin exigir que cada productor mantenga una tienda digital independiente.</w:t>
             </w:r>
             <w:r>
               <w:rPr>
@@ -526,7 +519,7 @@
                 <w:sz w:val="17"/>
               </w:rPr>
               <w:br/>
-              <w:t>Partimos de un MVP funcional desarrollado con Ionic 8, Angular 18 y SQLite. En este proyecto nosotros realizaremos su reingenieria hacia una solucion web responsive y con una arquitectura mas desacoplada, aprovechando Supabase para autenticacion y persistencia, Vue.js + Vite para el frontend y los servicios de backend que realmente sean necesarios para las reglas de negocio e integraciones.</w:t>
+              <w:t>Partimos de un MVP funcional desarrollado con Ionic 8, Angular 18 y SQLite. En este proyecto nosotros realizaremos su reingeniería hacia una solución web responsive y con una arquitectura más desacoplada, aprovechando Supabase para autenticación y persistencia, Vue.js + Vite para el frontend y los servicios de backend que realmente sean necesarios para las reglas de negocio e integraciones.</w:t>
             </w:r>
             <w:r>
               <w:rPr>
@@ -541,7 +534,7 @@
                 <w:sz w:val="17"/>
               </w:rPr>
               <w:br/>
-              <w:t>La actualizacion final de requerimientos tambien nos llevo a simplificar el alcance. Nosotros descartamos la geolocalizacion activa y la restriccion comunal, dejando solo la validacion por region; descartamos el historial de precios, el umbral automatico de stock y las fotografias obligatorias. En su lugar, incorporamos un codigo de verificacion al momento de la entrega, una calificacion simple de 1 a 5 con promedio y una gestion manual de sanciones desde el panel administrativo. Tambien ajustamos el flujo de pagos: adoptamos Webpay Mall (Split Payment) de Transbank, de modo que la plataforma ya no retiene la venta ni ejecuta payouts: la pasarela captura y dispersa el pago en tiempo real y deposita directo en la cuenta bancaria del comercio. Incorporamos ademas el ingreso del Codigo de Comercio Mall en el panel de administracion.</w:t>
+              <w:t>La actualización final de requerimientos también nos llevó a simplificar el alcance. Nosotros descartamos la geolocalización activa y la restricción comunal, dejando solo la validación por región; descartamos el historial de precios, el umbral automático de stock y las fotografías obligatorias. En su lugar, incorporamos un código de verificación al momento de la entrega, una calificación simple de 1 a 5 con promedio, una gestión de reclamos y una gestión manual de sanciones y apelaciones desde el panel administrativo. También ajustamos el flujo de pagos: adoptamos Webpay Mall (Split Payment) de Transbank, de modo que la pasarela captura y dispersa el pago en tiempo real y Transbank deposita directo en la cuenta bancaria del comercio. Incorporamos además el registro del Código de Comercio Mall en el panel de administración, como trámite posterior e independiente de la aprobación de la postulación.</w:t>
             </w:r>
             <w:r>
               <w:rPr>
@@ -556,7 +549,7 @@
                 <w:sz w:val="17"/>
               </w:rPr>
               <w:br/>
-              <w:t>Nuestra justificacion tambien es academica: nosotros aplicaremos planificacion, analisis, diseno, construccion, pruebas, implementacion, control de cambios y documentacion en un sistema donde las decisiones tecnicas afectan directamente los flujos de compra, venta, entrega, pagos y administracion.</w:t>
+              <w:t>Nuestra justificación también es académica: nosotros aplicaremos planificación, análisis, diseño, construcción, pruebas, implementación, control de cambios y documentación en un sistema donde las decisiones técnicas afectan directamente los flujos de compra, venta, entrega, pagos y administración.</w:t>
             </w:r>
           </w:p>
         </w:tc>
@@ -631,7 +624,15 @@
                 <w:rFonts w:asciiTheme="majorHAnsi" w:hAnsiTheme="majorHAnsi" w:cstheme="majorHAnsi"/>
                 <w:sz w:val="16"/>
               </w:rPr>
-              <w:t>Implementaremos la evolucion de CuTuCo desde el prototipo movil local hacia una plataforma web responsive. El frontend se desarrollara con Vue.js + Vite y se desplegara en Vercel. La persistencia se migrara a PostgreSQL en Supabase y utilizaremos Supabase Auth (GoTrue) para login, refresh, recuperacion y verificacion de cuentas. Para consultas simples utilizaremos PostgREST y dejaremos FastAPI acotado a las reglas que requieran logica adicional, como el bloqueo temporal por intentos fallidos, validaciones complementarias e integraciones que no sea conveniente resolver directamente desde Supabase.</w:t>
+              <w:t xml:space="preserve">Implementaremos la evolución de CuTuCo desde el prototipo móvil local hacia una plataforma web responsive. El frontend se desarrollará con Vue.js + Vite y se desplegará en Vercel. La persistencia se migrará a PostgreSQL en Supabase y utilizaremos Supabase Auth (GoTrue) para el registro, el inicio de sesión, el refresh de la sesión, la recuperación y la verificación de cuentas. Para las consultas simples y el CRUD utilizaremos PostgREST directamente desde el frontend, y dejaremos FastAPI acotado </w:t>
+            </w:r>
+            <w:r>
+              <w:rPr>
+                <w:rFonts w:asciiTheme="majorHAnsi" w:hAnsiTheme="majorHAnsi" w:cstheme="majorHAnsi"/>
+                <w:sz w:val="16"/>
+              </w:rPr>
+              <w:lastRenderedPageBreak/>
+              <w:t>exclusivamente a la lógica específica que requiera la integración con Webpay (Transbank).</w:t>
             </w:r>
             <w:r>
               <w:rPr>
@@ -646,15 +647,7 @@
                 <w:sz w:val="16"/>
               </w:rPr>
               <w:br/>
-              <w:t xml:space="preserve">El alcance final incluye registro de Cliente y Vendedor, aprobacion manual del productor con verificacion documental KYB (cedula o </w:t>
-            </w:r>
-            <w:r>
-              <w:rPr>
-                <w:rFonts w:asciiTheme="majorHAnsi" w:hAnsiTheme="majorHAnsi" w:cstheme="majorHAnsi"/>
-                <w:sz w:val="16"/>
-              </w:rPr>
-              <w:lastRenderedPageBreak/>
-              <w:t>E-RUT, Certificado de Inicio de Actividades del SII, certificado de titularidad bancaria y comprobante de domicilio o predio) e ingreso del Codigo de Comercio Mall, perfiles y permisos, navegacion publica sin login hasta el checkout, catalogo, carrito, compras, gestion de productos y stock, restricciones de compra por region, delivery con estados Preparacion -&gt; En Transito -&gt; Entregado y codigo de verificacion, Webpay Mall (Split Payment) de Transbank con liquidacion directa a la cuenta bancaria del comercio, sin custodia ni payouts propios, reembolsos post venta, calificaciones de 1 a 5, sanciones manuales y moderacion basica. Los datos financieros necesarios para la inscripcion de la cuenta bancaria en Transbank se manejaran con medidas de seguridad y cifrado.</w:t>
+              <w:t>El alcance final incluye registro de Cliente y Vendedor, aprobación de la postulación del productor con verificación documental KYB (cédula o E-RUT, Certificado de Inicio de Actividades del SII, certificado de titularidad bancaria y comprobante de domicilio o predio) e ingreso del Código de Comercio Mall, perfiles y permisos, navegación pública sin login hasta el checkout, catálogo, carrito, compras, gestión de productos y stock, restricciones de compra por región, delivery con estados Preparación -&gt; En Tránsito -&gt; Entregado y código de verificación, Webpay Mall (Split Payment) de Transbank, que captura y dispersa el pago en tiempo real y deposita directo en la cuenta bancaria del comercio, calificaciones de 1 a 5, gestión de reclamos, sanciones y apelaciones, y validación automática de palabras prohibidas. La aprobación de la postulación y el registro del Código de Comercio Mall son dos procesos distintos: el Administrador aprueba o rechaza la postulación revisando la documentación KYB, y el registro del Código de Comercio Mall se completa cuando finaliza el trámite correspondiente con Transbank, de forma posterior e independiente. Mientras un productor no tenga su código de comercio registrado no puede operar, por lo que las consultas de visualización del frontend excluyen a los productores y a los productos que no puedan operar por ese motivo. La tramitación legal y administrativa para habilitar la cuenta de Transbank queda fuera del flujo principal de la plataforma; los datos que envían los postulantes se protegen mediante controles de acceso, RLS, policies, grants y los permisos de almacenamiento correspondientes para los documentos de postulación.</w:t>
             </w:r>
             <w:r>
               <w:rPr>
@@ -669,7 +662,7 @@
                 <w:sz w:val="16"/>
               </w:rPr>
               <w:br/>
-              <w:t>Tambien nosotros incorporaremos comunicaciones por correo. Supabase Auth utilizara SMTP de Resend para recuperacion, bienvenida y verificacion, mientras que las notificaciones propias del negocio se gestionaran mediante Resend API. La administracion mantendra CRUD de usuarios y las reglas de moderacion necesarias, incluyendo una lista configurable de palabras prohibidas. No incluiremos como alcance del MVP la geolocalizacion GPS, el historial de precios, las alertas automaticas por umbral de stock, las fotografias obligatorias, la reputacion algoritmica, el tracking con mapa en tiempo real ni Redis de Upstash, porque el informe actualizado los deja fuera o los considera sobreingenieria para esta etapa.</w:t>
+              <w:t>También nosotros incorporaremos comunicaciones por correo. Supabase Auth utilizará el SMTP de Resend para los correos de bienvenida, verificación de cuenta y recuperación de contraseña, mientras que las notificaciones propias del negocio se gestionarán mediante la API de Resend: el detalle de la compra al comprador y el aviso de nuevo pedido al vendedor. La administración mantendrá el listado de usuarios, la visualización de su detalle y la activación o desactivación de cuentas de clientes, junto con la validación automática de palabras prohibidas mediante triggers de PostgreSQL, incluida la lógica BEFORE INSERT existente. No incluiremos como alcance del MVP la geolocalización GPS, el historial de precios, las alertas automáticas por umbral de stock, las fotografías obligatorias, la reputación algorítmica, el tracking con mapa en tiempo real ni Redis de Upstash, porque el informe actualizado los deja fuera o los considera sobreingeniería para esta etapa.</w:t>
             </w:r>
             <w:r>
               <w:rPr>
@@ -684,7 +677,7 @@
                 <w:sz w:val="16"/>
               </w:rPr>
               <w:br/>
-              <w:t>Para administrar el proyecto nosotros entregaremos, por fases, el Acta de Constitucion; EDT; Hitos de Desarrollo y Diccionario; Carta Gantt; RACI; Matriz de Riesgos; Plan de Pruebas Inicial; ERS; modelos de datos y arquitectura; mockups; Plan de Calidad y de Costos; codigo fuente y documentacion interna; base de datos y scripts de creacion; minuta de control de programacion; verificacion de alcances; Plan de Pruebas Final y Reporte de Estatus Final; Plan de Implantacion, Soporte y Mantenimiento; y Manuales de Usuario y Administrador.</w:t>
+              <w:t>Para administrar el proyecto nosotros entregaremos, por fases, el Acta de Constitución; EDT; Hitos de Desarrollo y Diccionario; Carta Gantt; RACI; Matriz de Riesgos; Plan de Pruebas Inicial; ERS; modelos de datos y arquitectura; mockups; Plan de Calidad y de Costos; código fuente y documentación interna; base de datos y scripts de creación; minuta de control de programación; verificación de alcances; Plan de Pruebas Final y Reporte de Estatus Final; Plan de Implantación, Soporte y Mantenimiento; y Manuales de Usuario y Administrador.</w:t>
             </w:r>
           </w:p>
         </w:tc>
@@ -945,7 +938,7 @@
                 <w:rFonts w:asciiTheme="majorHAnsi" w:hAnsiTheme="majorHAnsi" w:cstheme="majorHAnsi"/>
                 <w:sz w:val="16"/>
               </w:rPr>
-              <w:t>Implementaremos una plataforma Marketplace web funcional a partir del MVP existente, migrando la interfaz a Vue.js + Vite y la persistencia a PostgreSQL en Supabase, utilizando Supabase Auth y PostgREST y manteniendo FastAPI solo donde se requiera logica adicional.</w:t>
+              <w:t>Implementaremos una plataforma Marketplace web funcional a partir del MVP existente, migrando la interfaz a Vue.js + Vite y la persistencia a PostgreSQL en Supabase, utilizando Supabase Auth y PostgREST para las consultas simples y el CRUD, y manteniendo FastAPI solo para la lógica específica de la integración con Webpay.</w:t>
             </w:r>
           </w:p>
         </w:tc>
@@ -971,7 +964,7 @@
                 <w:rFonts w:asciiTheme="majorHAnsi" w:hAnsiTheme="majorHAnsi" w:cstheme="majorHAnsi"/>
                 <w:sz w:val="16"/>
               </w:rPr>
-              <w:t>Podremos ejecutar los modulos principales con persistencia remota y comunicacion entre las capas definidas, sin depender de datos locales del dispositivo.</w:t>
+              <w:t>Podremos ejecutar los módulos principales con persistencia remota y comunicación entre las capas definidas, sin depender de datos locales del dispositivo.</w:t>
             </w:r>
           </w:p>
         </w:tc>
@@ -999,7 +992,7 @@
                 <w:rFonts w:asciiTheme="majorHAnsi" w:hAnsiTheme="majorHAnsi" w:cstheme="majorHAnsi"/>
                 <w:sz w:val="16"/>
               </w:rPr>
-              <w:t>Incorporaremos los flujos finales de compra, venta y administracion: registro y aprobacion de productores, perfiles, catalogo, carrito, compra, restriccion por region, Webpay Mall (Split Payment), liquidacion directa por pasarela, reembolso, delivery con codigo de verificacion, calificacion 1 a 5, sanciones manuales, moderacion y correos de negocio.</w:t>
+              <w:t>Incorporaremos los flujos finales de compra, venta y administración: registro y aprobación de productores, perfiles, catálogo, carrito, compra, restricción por región, Webpay Mall (Split Payment) con dispersión directa por pasarela, delivery con código de verificación, calificación de 1 a 5, gestión de reclamos, sanciones y apelaciones, validación automática de palabras prohibidas y correos de negocio.</w:t>
             </w:r>
           </w:p>
         </w:tc>
@@ -1025,7 +1018,7 @@
                 <w:rFonts w:asciiTheme="majorHAnsi" w:hAnsiTheme="majorHAnsi" w:cstheme="majorHAnsi"/>
                 <w:sz w:val="16"/>
               </w:rPr>
-              <w:t>Podremos recorrer los flujos criticos de principio a fin y cada regla incluida tendra una prueba o evidencia que permita comprobar su resultado.</w:t>
+              <w:t>Podremos recorrer los flujos críticos de principio a fin y cada regla incluida tendrá una prueba o evidencia que permita comprobar su resultado.</w:t>
             </w:r>
           </w:p>
         </w:tc>
@@ -1053,6 +1046,7 @@
                 <w:rFonts w:asciiTheme="majorHAnsi" w:hAnsiTheme="majorHAnsi" w:cstheme="majorHAnsi"/>
                 <w:sz w:val="16"/>
               </w:rPr>
+              <w:lastRenderedPageBreak/>
               <w:t>Mantendremos el alcance controlado durante las 13 semanas y documentaremos cualquier cambio antes de incorporarlo.</w:t>
             </w:r>
           </w:p>
@@ -1149,7 +1143,7 @@
                 <w:rFonts w:asciiTheme="majorHAnsi" w:hAnsiTheme="majorHAnsi" w:cstheme="majorHAnsi"/>
                 <w:sz w:val="16"/>
               </w:rPr>
-              <w:t>Comenzaremos el proyecto en la Semana 1, el 11 de septiembre, terminaremos la fase de desarrollo en la Semana 11 y reservaremos las Semanas 12 y 13 para preparacion, validacion final y entrega.</w:t>
+              <w:t>Comenzaremos el proyecto en la Semana 1, el 11 de septiembre, terminaremos la fase de desarrollo en la Semana 11 y reservaremos las Semanas 12 y 13 para preparación, validación final y entrega.</w:t>
             </w:r>
           </w:p>
         </w:tc>
@@ -1175,7 +1169,7 @@
                 <w:rFonts w:asciiTheme="majorHAnsi" w:hAnsiTheme="majorHAnsi" w:cstheme="majorHAnsi"/>
                 <w:sz w:val="16"/>
               </w:rPr>
-              <w:t>Cerraremos la construccion e integracion al terminar la Semana 11 y utilizaremos las dos semanas finales para regresion, correcciones, consolidacion documental y entrega.</w:t>
+              <w:t>Cerraremos la construcción e integración al terminar la Semana 11 y utilizaremos las dos semanas finales para regresión, correcciones, consolidación documental y entrega.</w:t>
             </w:r>
           </w:p>
         </w:tc>
@@ -1203,7 +1197,7 @@
                 <w:rFonts w:asciiTheme="majorHAnsi" w:hAnsiTheme="majorHAnsi" w:cstheme="majorHAnsi"/>
                 <w:sz w:val="16"/>
               </w:rPr>
-              <w:t>Organizaremos el trabajo en cuatro fases: Planificacion Inicial; Analisis y Diseno; Construccion; Implementacion y Cierre.</w:t>
+              <w:t>Organizaremos el trabajo en cuatro fases: Planificación Inicial; Análisis y Diseño; Construcción; Implementación y Cierre.</w:t>
             </w:r>
           </w:p>
         </w:tc>
@@ -1229,15 +1223,7 @@
                 <w:rFonts w:asciiTheme="majorHAnsi" w:hAnsiTheme="majorHAnsi" w:cstheme="majorHAnsi"/>
                 <w:sz w:val="16"/>
               </w:rPr>
-              <w:t xml:space="preserve">Cada fase tendra sus entregables definidos y evidencia de ejecucion, manteniendo </w:t>
-            </w:r>
-            <w:r>
-              <w:rPr>
-                <w:rFonts w:asciiTheme="majorHAnsi" w:hAnsiTheme="majorHAnsi" w:cstheme="majorHAnsi"/>
-                <w:sz w:val="16"/>
-              </w:rPr>
-              <w:lastRenderedPageBreak/>
-              <w:t>trazabilidad entre los documentos y el producto final.</w:t>
+              <w:t>Cada fase tendrá sus entregables definidos y evidencia de ejecución, manteniendo trazabilidad entre los documentos y el producto final.</w:t>
             </w:r>
           </w:p>
         </w:tc>
@@ -1265,8 +1251,7 @@
                 <w:rFonts w:asciiTheme="majorHAnsi" w:hAnsiTheme="majorHAnsi" w:cstheme="majorHAnsi"/>
                 <w:sz w:val="16"/>
               </w:rPr>
-              <w:lastRenderedPageBreak/>
-              <w:t>Realizaremos una revision semanal del estado del proyecto.</w:t>
+              <w:t>Realizaremos una revisión semanal del estado del proyecto.</w:t>
             </w:r>
           </w:p>
         </w:tc>
@@ -1292,7 +1277,7 @@
                 <w:rFonts w:asciiTheme="majorHAnsi" w:hAnsiTheme="majorHAnsi" w:cstheme="majorHAnsi"/>
                 <w:sz w:val="16"/>
               </w:rPr>
-              <w:t>Cada semana dejaremos registrada la situacion del alcance, avances, bloqueos, riesgos, decisiones y pendientes que puedan afectar la entrega.</w:t>
+              <w:t>Cada semana dejaremos registrada la situación del alcance, avances, bloqueos, riesgos, decisiones y pendientes que puedan afectar la entrega.</w:t>
             </w:r>
           </w:p>
         </w:tc>
@@ -1362,7 +1347,7 @@
                 <w:rFonts w:asciiTheme="majorHAnsi" w:hAnsiTheme="majorHAnsi" w:cstheme="majorHAnsi"/>
                 <w:sz w:val="16"/>
               </w:rPr>
-              <w:t>Priorizaremos una infraestructura de bajo costo para el MVP academico, utilizando los niveles gratuitos disponibles y los creditos de GCP para los componentes que lo requieran.</w:t>
+              <w:t>Priorizaremos una infraestructura de bajo costo para el MVP académico, utilizando los niveles gratuitos disponibles y los créditos de GCP para los componentes que lo requieran.</w:t>
             </w:r>
           </w:p>
         </w:tc>
@@ -1388,7 +1373,7 @@
                 <w:rFonts w:asciiTheme="majorHAnsi" w:hAnsiTheme="majorHAnsi" w:cstheme="majorHAnsi"/>
                 <w:sz w:val="16"/>
               </w:rPr>
-              <w:t>La Opcion A mantendra el costo operativo del MVP en el orden estimado de USD 12 al ano por dominio, considerando que los servicios gratuitos y creditos disponibles cubren el resto de la infraestructura academica.</w:t>
+              <w:t>La Opción A mantendrá el costo operativo del MVP en el orden estimado de USD 12 al año por dominio, considerando que los servicios gratuitos y créditos disponibles cubren el resto de la infraestructura académica.</w:t>
             </w:r>
           </w:p>
         </w:tc>
@@ -1416,7 +1401,7 @@
                 <w:rFonts w:asciiTheme="majorHAnsi" w:hAnsiTheme="majorHAnsi" w:cstheme="majorHAnsi"/>
                 <w:sz w:val="16"/>
               </w:rPr>
-              <w:t>Dejaremos documentada una proyeccion de infraestructura para una etapa productiva y de continuidad del sistema.</w:t>
+              <w:t>Dejaremos documentada una proyección de infraestructura para una etapa productiva y de continuidad del sistema.</w:t>
             </w:r>
           </w:p>
         </w:tc>
@@ -1442,7 +1427,7 @@
                 <w:rFonts w:asciiTheme="majorHAnsi" w:hAnsiTheme="majorHAnsi" w:cstheme="majorHAnsi"/>
                 <w:sz w:val="16"/>
               </w:rPr>
-              <w:t>La Opcion B quedara como referencia presupuestaria, con un costo estimado de USD 100 a 120 mensuales mas comisiones de transaccion, sin tratarlo como gasto comprometido del MVP.</w:t>
+              <w:t>La Opción B quedará como referencia presupuestaria, con un costo estimado de USD 100 a 120 mensuales más comisiones de transacción, sin tratarlo como gasto comprometido del MVP.</w:t>
             </w:r>
           </w:p>
         </w:tc>
@@ -1470,7 +1455,7 @@
                 <w:rFonts w:asciiTheme="majorHAnsi" w:hAnsiTheme="majorHAnsi" w:cstheme="majorHAnsi"/>
                 <w:sz w:val="16"/>
               </w:rPr>
-              <w:t>Controlaremos cualquier variacion de costo antes de incorporar servicios que aumenten el gasto.</w:t>
+              <w:t>Controlaremos cualquier variación de costo antes de incorporar servicios que aumenten el gasto.</w:t>
             </w:r>
           </w:p>
         </w:tc>
@@ -1496,7 +1481,7 @@
                 <w:rFonts w:asciiTheme="majorHAnsi" w:hAnsiTheme="majorHAnsi" w:cstheme="majorHAnsi"/>
                 <w:sz w:val="16"/>
               </w:rPr>
-              <w:t>Las decisiones con impacto economico se revisaran entre nosotros y no comprometemos infraestructura productiva fuera del presupuesto definido.</w:t>
+              <w:t>Las decisiones con impacto económico se revisarán entre nosotros y no comprometemos infraestructura productiva fuera del presupuesto definido.</w:t>
             </w:r>
           </w:p>
         </w:tc>
@@ -1566,7 +1551,7 @@
                 <w:rFonts w:asciiTheme="majorHAnsi" w:hAnsiTheme="majorHAnsi" w:cstheme="majorHAnsi"/>
                 <w:sz w:val="16"/>
               </w:rPr>
-              <w:t>Aplicaremos pruebas unitarias, de integracion y de extremo a extremo sobre los flujos criticos y sobre las reglas que actualizamos al cierre del alcance.</w:t>
+              <w:t>Aplicaremos pruebas unitarias, de integración y de extremo a extremo sobre los flujos críticos y sobre las reglas que actualizamos al cierre del alcance.</w:t>
             </w:r>
           </w:p>
         </w:tc>
@@ -1592,7 +1577,7 @@
                 <w:rFonts w:asciiTheme="majorHAnsi" w:hAnsiTheme="majorHAnsi" w:cstheme="majorHAnsi"/>
                 <w:sz w:val="16"/>
               </w:rPr>
-              <w:t>Dejaremos evidencia de pruebas sobre autenticacion, roles, compra, Webpay Mall, reembolso, delivery con codigo, calificacion, sanciones, moderacion y comunicaciones.</w:t>
+              <w:t>Dejaremos evidencia de pruebas sobre autenticación, roles, compra, Webpay Mall, delivery con código, calificación, reclamos, sanciones y apelaciones, validación automática de palabras prohibidas y comunicaciones.</w:t>
             </w:r>
           </w:p>
         </w:tc>
@@ -1646,7 +1631,7 @@
                 <w:rFonts w:asciiTheme="majorHAnsi" w:hAnsiTheme="majorHAnsi" w:cstheme="majorHAnsi"/>
                 <w:sz w:val="16"/>
               </w:rPr>
-              <w:t>Utilizaremos Supabase Auth, RLS y politicas revisadas, validaciones en frontend y backend, restricciones de base de datos, manejo de errores, secretos fuera del codigo y cifrado para la informacion financiera necesaria para la liquidacion via pasarela.</w:t>
+              <w:t>Utilizaremos Supabase Auth, roles, RLS, policies y grants revisados, las restricciones de la base de datos, el manejo de errores y los secretos fuera del código; los documentos de postulación se resguardan con los permisos de almacenamiento correspondientes.</w:t>
             </w:r>
           </w:p>
         </w:tc>
@@ -1700,7 +1685,7 @@
                 <w:rFonts w:asciiTheme="majorHAnsi" w:hAnsiTheme="majorHAnsi" w:cstheme="majorHAnsi"/>
                 <w:sz w:val="16"/>
               </w:rPr>
-              <w:t>Usaremos Git con ramas de trabajo, revision de cambios, documentos actualizados y registros de decisiones para mantener coherencia entre codigo, pruebas y entregables.</w:t>
+              <w:t>Usaremos Git con ramas de trabajo, revisión de cambios, documentos actualizados y registros de decisiones para mantener coherencia entre código, pruebas y entregables.</w:t>
             </w:r>
           </w:p>
         </w:tc>
@@ -1773,7 +1758,7 @@
                 <w:rFonts w:asciiTheme="majorHAnsi" w:hAnsiTheme="majorHAnsi" w:cstheme="majorHAnsi"/>
                 <w:sz w:val="16"/>
               </w:rPr>
-              <w:t>Dividiremos el trabajo principalmente entre backend y frontend, manteniendo compartidas la arquitectura, las pruebas, la documentacion, el control de cambios y la coordinacion.</w:t>
+              <w:t>Dividiremos el trabajo principalmente entre backend y frontend, manteniendo compartidas la arquitectura, las pruebas, la documentación, el control de cambios y la coordinación.</w:t>
             </w:r>
           </w:p>
         </w:tc>
@@ -1799,7 +1784,7 @@
                 <w:rFonts w:asciiTheme="majorHAnsi" w:hAnsiTheme="majorHAnsi" w:cstheme="majorHAnsi"/>
                 <w:sz w:val="16"/>
               </w:rPr>
-              <w:t>Repartiremos las responsabilidades principales entre Vicente Rivera en backend/Jefe de Proyecto e Ignacio Fuenzalida en frontend, sin dejar de revisar juntos las decisiones que afectan al proyecto completo.</w:t>
+              <w:t>Repartiremos las responsabilidades principales entre Vicente Rivera en backend/Jefe de Proyecto e Ignacio Fuenzalida en frontend, con responsabilidades compartidas en actividades y entregables, sin dejar de revisar juntos las decisiones que afectan al proyecto completo.</w:t>
             </w:r>
           </w:p>
         </w:tc>
@@ -1853,7 +1838,15 @@
                 <w:rFonts w:asciiTheme="majorHAnsi" w:hAnsiTheme="majorHAnsi" w:cstheme="majorHAnsi"/>
                 <w:sz w:val="16"/>
               </w:rPr>
-              <w:t>Las nuevas solicitudes se evaluaran antes de aceptarlas y las funciones que el alcance final haya descartado no se reincorporaran durante el MVP sin una decision formal.</w:t>
+              <w:t xml:space="preserve">Las nuevas solicitudes se evaluarán antes de aceptarlas y las funciones que el alcance </w:t>
+            </w:r>
+            <w:r>
+              <w:rPr>
+                <w:rFonts w:asciiTheme="majorHAnsi" w:hAnsiTheme="majorHAnsi" w:cstheme="majorHAnsi"/>
+                <w:sz w:val="16"/>
+              </w:rPr>
+              <w:lastRenderedPageBreak/>
+              <w:t>final haya descartado no se reincorporarán durante el MVP sin una decisión formal.</w:t>
             </w:r>
           </w:p>
         </w:tc>
@@ -1881,7 +1874,8 @@
                 <w:rFonts w:asciiTheme="majorHAnsi" w:hAnsiTheme="majorHAnsi" w:cstheme="majorHAnsi"/>
                 <w:sz w:val="16"/>
               </w:rPr>
-              <w:t>Dejaremos preparada la documentacion necesaria para la continuidad y el soporte del sistema.</w:t>
+              <w:lastRenderedPageBreak/>
+              <w:t>Dejaremos preparada la documentación necesaria para la continuidad y el soporte del sistema.</w:t>
             </w:r>
           </w:p>
         </w:tc>
@@ -1907,7 +1901,7 @@
                 <w:rFonts w:asciiTheme="majorHAnsi" w:hAnsiTheme="majorHAnsi" w:cstheme="majorHAnsi"/>
                 <w:sz w:val="16"/>
               </w:rPr>
-              <w:t>Entregaremos manuales, plan de implantacion, soporte y mantenimiento, ademas de la documentacion de arquitectura, configuracion y despliegue.</w:t>
+              <w:t>Entregaremos manuales, plan de implantación, soporte y mantenimiento, además de la documentación de arquitectura, configuración y despliegue.</w:t>
             </w:r>
           </w:p>
         </w:tc>
@@ -1991,15 +1985,7 @@
                 <w:sz w:val="16"/>
               </w:rPr>
               <w:br/>
-              <w:t xml:space="preserve">- Migracion de SQLite a PostgreSQL: podemos encontrar diferencias de estructura, relaciones o datos. Nosotros mitigaremos este </w:t>
-            </w:r>
-            <w:r>
-              <w:rPr>
-                <w:rFonts w:asciiTheme="majorHAnsi" w:hAnsiTheme="majorHAnsi" w:cstheme="majorHAnsi"/>
-                <w:sz w:val="16"/>
-              </w:rPr>
-              <w:lastRenderedPageBreak/>
-              <w:t>riesgo revisando el modelo, preparando scripts y validando con datos de prueba antes de cerrar la migracion.</w:t>
+              <w:t>- Migración de SQLite a PostgreSQL: podemos encontrar diferencias de estructura, relaciones o datos. Nosotros mitigaremos este riesgo revisando el modelo, preparando scripts y validando con datos de prueba antes de cerrar la migración.</w:t>
             </w:r>
             <w:r>
               <w:rPr>
@@ -2007,7 +1993,7 @@
                 <w:sz w:val="16"/>
               </w:rPr>
               <w:br/>
-              <w:t>- Integracion y consistencia de Webpay: un error de retorno o una transaccion repetida puede generar inconsistencias. Nosotros utilizaremos identificadores unicos, registros de estado, manejo de errores y validaciones antes de confirmar cada operacion.</w:t>
+              <w:t>- Integración y consistencia de Webpay: un error de retorno o una transacción repetida puede generar inconsistencias. Nosotros utilizaremos identificadores únicos, registros de estado, manejo de errores y validaciones antes de confirmar cada operación.</w:t>
             </w:r>
             <w:r>
               <w:rPr>
@@ -2015,7 +2001,7 @@
                 <w:sz w:val="16"/>
               </w:rPr>
               <w:br/>
-              <w:t>- Liquidacion y reembolsos: como la dispersion del pago la realiza Transbank via Split Payment y deposita directo en la cuenta bancaria del comercio, debemos mantener una trazabilidad clara del pago, la entrega y un eventual reembolso. Nosotros separaremos estos estados en la base de datos y protegeremos la informacion financiera del comercio.</w:t>
+              <w:t>- Dispersión del pago y conciliación: la dispersión la realiza Transbank mediante Split Payment y deposita directo en la cuenta bancaria del comercio, por lo que debemos mantener una trazabilidad clara del pago y de la entrega. Nosotros separaremos estos estados en la base de datos y protegeremos los datos bancarios y financieros del comercio con las políticas de acceso correspondientes.</w:t>
             </w:r>
             <w:r>
               <w:rPr>
@@ -2023,7 +2009,7 @@
                 <w:sz w:val="16"/>
               </w:rPr>
               <w:br/>
-              <w:t>- Seguridad de autenticacion: dependeremos de Supabase Auth y RLS para gran parte de la seguridad. Nosotros revisaremos las policies y mantendremos FastAPI solo para el bloqueo de cuenta por cinco intentos fallidos y las validaciones adicionales que sean necesarias.</w:t>
+              <w:t>- Seguridad de autenticación: la seguridad se apoya en Supabase Auth (GoTrue), los roles, las RLS, las policies y los grants. Nosotros revisaremos esas configuraciones y ajustaremos los permisos por rol, sin implementar reglas de autenticación propias en FastAPI.</w:t>
             </w:r>
             <w:r>
               <w:rPr>
@@ -2039,7 +2025,7 @@
                 <w:sz w:val="16"/>
               </w:rPr>
               <w:br/>
-              <w:t>- Validacion regional y delivery: una regla mal aplicada puede permitir compras que no corresponden a la cobertura del proyecto. Nosotros validaremos exclusivamente la region y utilizaremos un codigo de verificacion para respaldar la entrega, sin depender de GPS o mapas en tiempo real.</w:t>
+              <w:t>- Validación regional y delivery: una regla mal aplicada puede permitir compras que no corresponden a la cobertura del proyecto. Nosotros validaremos exclusivamente la región y utilizaremos un código de verificación para respaldar la entrega, sin depender de GPS o mapas en tiempo real.</w:t>
             </w:r>
             <w:r>
               <w:rPr>
@@ -2047,7 +2033,7 @@
                 <w:sz w:val="16"/>
               </w:rPr>
               <w:br/>
-              <w:t>- Alcance excesivo para un equipo de dos personas: una ampliacion no controlada puede comprometer el cronograma. Nosotros revisaremos semanalmente el alcance y mantendremos fuera del MVP las funcionalidades descartadas en la actualizacion final.</w:t>
+              <w:t>- Alcance excesivo para un equipo de dos personas: una ampliación no controlada puede comprometer el cronograma. Nosotros revisaremos semanalmente el alcance y mantendremos fuera del MVP las funcionalidades descartadas en la actualización final.</w:t>
             </w:r>
           </w:p>
         </w:tc>
@@ -2070,7 +2056,6 @@
           <w:rFonts w:asciiTheme="majorHAnsi" w:hAnsiTheme="majorHAnsi" w:cstheme="majorHAnsi"/>
           <w:color w:val="005693"/>
         </w:rPr>
-        <w:lastRenderedPageBreak/>
         <w:br/>
         <w:t>Cronograma de hitos principales</w:t>
       </w:r>
@@ -2186,7 +2171,7 @@
                 <w:rFonts w:asciiTheme="majorHAnsi" w:hAnsiTheme="majorHAnsi" w:cstheme="majorHAnsi"/>
                 <w:sz w:val="16"/>
               </w:rPr>
-              <w:t>Inicio y Planificacion Inicial: Acta, EDT, Hitos, Carta Gantt, RACI, Matriz de Riesgos y Plan de Pruebas Inicial</w:t>
+              <w:t>Inicio y Planificación Inicial: Acta, EDT, Hitos, Carta Gantt, RACI, Matriz de Riesgos y Plan de Pruebas Inicial</w:t>
             </w:r>
           </w:p>
         </w:tc>
@@ -2240,7 +2225,7 @@
                 <w:rFonts w:asciiTheme="majorHAnsi" w:hAnsiTheme="majorHAnsi" w:cstheme="majorHAnsi"/>
                 <w:sz w:val="16"/>
               </w:rPr>
-              <w:t>Analisis y Diseno: ERS, criterios de aceptacion, modelo de datos, arquitectura, reglas de seguridad, flujo de pagos y mockups</w:t>
+              <w:t>Análisis y Diseño: ERS, criterios de aceptación, modelo de datos, arquitectura, reglas de seguridad, flujo de pagos y mockups</w:t>
             </w:r>
           </w:p>
         </w:tc>
@@ -2294,7 +2279,7 @@
                 <w:rFonts w:asciiTheme="majorHAnsi" w:hAnsiTheme="majorHAnsi" w:cstheme="majorHAnsi"/>
                 <w:sz w:val="16"/>
               </w:rPr>
-              <w:t>Construccion: frontend, persistencia, autenticacion, modulos de Cliente/Vendedor/Administracion e integraciones principales</w:t>
+              <w:t>Construcción: frontend, persistencia, autenticación, módulos de Cliente/Vendedor/Administración e integraciones principales</w:t>
             </w:r>
           </w:p>
         </w:tc>
@@ -2348,7 +2333,7 @@
                 <w:rFonts w:asciiTheme="majorHAnsi" w:hAnsiTheme="majorHAnsi" w:cstheme="majorHAnsi"/>
                 <w:sz w:val="16"/>
               </w:rPr>
-              <w:t>Integracion y validacion: Webpay Mall (Split Payment), reembolsos, delivery con codigo, calificacion, sanciones, correos y pruebas de integracion</w:t>
+              <w:t>Integración y validación: Webpay Mall (Split Payment), reclamos, delivery con código, calificación, sanciones y apelaciones, correos y pruebas de integración</w:t>
             </w:r>
           </w:p>
         </w:tc>
@@ -2402,7 +2387,7 @@
                 <w:rFonts w:asciiTheme="majorHAnsi" w:hAnsiTheme="majorHAnsi" w:cstheme="majorHAnsi"/>
                 <w:sz w:val="16"/>
               </w:rPr>
-              <w:t>Cierre de desarrollo, correcciones, regresion y verificacion del alcance actualizado</w:t>
+              <w:t>Cierre de desarrollo, correcciones, regresión y verificación del alcance actualizado</w:t>
             </w:r>
           </w:p>
         </w:tc>
@@ -2499,22 +2484,22 @@
                 <w:rFonts w:asciiTheme="majorHAnsi" w:hAnsiTheme="majorHAnsi" w:cstheme="majorHAnsi"/>
                 <w:sz w:val="16"/>
               </w:rPr>
-              <w:t>Trabajaremos con la Opcion A para el MVP academico: Vercel Hobby USD 0, Supabase en nivel gratuito, los componentes necesarios de backend en Cloud Run utilizando los creditos GCP disponibles y un dominio estimado en USD 12 al ano. El informe estima un costo operativo aproximado de USD 12 para el MVP, sin considerar los creditos gratuitos ni nuestras horas de trabajo academico.</w:t>
-            </w:r>
-          </w:p>
-          <w:p>
-            <w:pPr>
-              <w:spacing w:after="0" w:line="240" w:lineRule="auto"/>
-              <w:rPr>
-                <w:rFonts w:asciiTheme="majorHAnsi" w:hAnsiTheme="majorHAnsi" w:cstheme="majorHAnsi"/>
-              </w:rPr>
-            </w:pPr>
-            <w:r>
-              <w:rPr>
-                <w:rFonts w:asciiTheme="majorHAnsi" w:hAnsiTheme="majorHAnsi" w:cstheme="majorHAnsi"/>
-                <w:sz w:val="16"/>
-              </w:rPr>
-              <w:t>El modelo de negocio actualizado contempla una tarifa fija de delivery de 3.500 CLP mas el fee correspondiente, mientras que la suscripcion mensual se deja como evaluacion para una futura Opcion B. En el flujo de pagos no hay custodia ni payouts propios: Webpay Mall (Split Payment) captura y dispersa el pago en tiempo real, y Transbank deposita directo en la cuenta bancaria del comercio. Antes de aprobar al vendedor validamos la cuenta bancaria con el certificado de titularidad bancaria e ingresamos el Codigo de Comercio Mall en el panel de administracion. Tambien dejaremos preparado el manejo de reembolsos post venta.</w:t>
+              <w:t>Trabajaremos con la Opción A para el MVP académico: Vercel Hobby USD 0, Supabase en nivel gratuito, los componentes necesarios de backend en Cloud Run utilizando los créditos GCP disponibles y un dominio estimado en USD 12 al año. El informe estima un costo operativo aproximado de USD 12 para el MVP, sin considerar los créditos gratuitos ni nuestras horas de trabajo académico.</w:t>
+            </w:r>
+          </w:p>
+          <w:p>
+            <w:pPr>
+              <w:spacing w:after="0" w:line="240" w:lineRule="auto"/>
+              <w:rPr>
+                <w:rFonts w:asciiTheme="majorHAnsi" w:hAnsiTheme="majorHAnsi" w:cstheme="majorHAnsi"/>
+              </w:rPr>
+            </w:pPr>
+            <w:r>
+              <w:rPr>
+                <w:rFonts w:asciiTheme="majorHAnsi" w:hAnsiTheme="majorHAnsi" w:cstheme="majorHAnsi"/>
+                <w:sz w:val="16"/>
+              </w:rPr>
+              <w:t>El modelo de negocio proyectado contempla una tarifa fija de delivery de 3.500 CLP más el fee correspondiente, y una suscripción mensual o anual por productor que hoy queda fuera de la facturación del MVP. En el flujo de pagos, Webpay Mall (Split Payment) captura y dispersa el pago en tiempo real y Transbank deposita directo en la cuenta bancaria del comercio. La aprobación de la postulación y el registro del Código de Comercio Mall son dos procesos distintos: el Administrador aprueba o rechaza la postulación revisando la documentación KYB, y el registro del Código de Comercio Mall se completa después, cuando finaliza el trámite con Transbank.</w:t>
             </w:r>
           </w:p>
           <w:p>
@@ -2529,7 +2514,7 @@
                 <w:rFonts w:asciiTheme="majorHAnsi" w:hAnsiTheme="majorHAnsi" w:cstheme="majorHAnsi"/>
                 <w:sz w:val="16"/>
               </w:rPr>
-              <w:t>Documentaremos una Opcion B productiva como referencia de continuidad, estimada en USD 100 a 120 mensuales mas comisiones de Webpay. Esta proyeccion no representa un gasto comprometido para el periodo academico.</w:t>
+              <w:t>Documentaremos una Opción B productiva como referencia de continuidad, estimada en USD 100 a 120 mensuales más comisiones de Webpay. Esta proyección no representa un gasto comprometido para el periodo académico.</w:t>
             </w:r>
           </w:p>
         </w:tc>
@@ -2550,6 +2535,7 @@
           <w:rFonts w:asciiTheme="majorHAnsi" w:hAnsiTheme="majorHAnsi" w:cstheme="majorHAnsi"/>
           <w:b w:val="0"/>
         </w:rPr>
+        <w:lastRenderedPageBreak/>
         <w:br/>
       </w:r>
       <w:r>
@@ -2765,7 +2751,7 @@
                 <w:rFonts w:asciiTheme="majorHAnsi" w:hAnsiTheme="majorHAnsi" w:cstheme="majorHAnsi"/>
                 <w:sz w:val="15"/>
               </w:rPr>
-              <w:t>Lider backend / Jefe de Proyecto</w:t>
+              <w:t>Líder backend / Jefe de Proyecto (con responsabilidades compartidas con Ignacio Fuenzalida en actividades y entregables)</w:t>
             </w:r>
           </w:p>
         </w:tc>
@@ -2791,7 +2777,7 @@
                 <w:rFonts w:asciiTheme="majorHAnsi" w:hAnsiTheme="majorHAnsi" w:cstheme="majorHAnsi"/>
                 <w:sz w:val="15"/>
               </w:rPr>
-              <w:t>Ingenieria en Informatica, Duoc UC Plaza Norte</w:t>
+              <w:t>Ingeniería en Informática, Duoc UC Plaza Norte</w:t>
             </w:r>
           </w:p>
         </w:tc>
@@ -2871,7 +2857,7 @@
                 <w:rFonts w:asciiTheme="majorHAnsi" w:hAnsiTheme="majorHAnsi" w:cstheme="majorHAnsi"/>
                 <w:sz w:val="15"/>
               </w:rPr>
-              <w:t>Ingenieria en Informatica, Duoc UC Plaza Norte</w:t>
+              <w:t>Ingeniería en Informática, Duoc UC Plaza Norte</w:t>
             </w:r>
           </w:p>
         </w:tc>
@@ -2925,7 +2911,7 @@
                 <w:rFonts w:asciiTheme="majorHAnsi" w:hAnsiTheme="majorHAnsi" w:cstheme="majorHAnsi"/>
                 <w:sz w:val="15"/>
               </w:rPr>
-              <w:t>Institucion academica</w:t>
+              <w:t>Institución académica</w:t>
             </w:r>
           </w:p>
         </w:tc>
@@ -2951,7 +2937,7 @@
                 <w:rFonts w:asciiTheme="majorHAnsi" w:hAnsiTheme="majorHAnsi" w:cstheme="majorHAnsi"/>
                 <w:sz w:val="15"/>
               </w:rPr>
-              <w:t>Ingenieria en Informatica / proyecto Capstone</w:t>
+              <w:t>Ingeniería en Informática / proyecto Capstone</w:t>
             </w:r>
           </w:p>
         </w:tc>
@@ -2979,7 +2965,6 @@
                 <w:rFonts w:asciiTheme="majorHAnsi" w:hAnsiTheme="majorHAnsi" w:cstheme="majorHAnsi"/>
                 <w:sz w:val="15"/>
               </w:rPr>
-              <w:lastRenderedPageBreak/>
               <w:t>Equipo docente de la asignatura</w:t>
             </w:r>
           </w:p>
@@ -3006,7 +2991,7 @@
                 <w:rFonts w:asciiTheme="majorHAnsi" w:hAnsiTheme="majorHAnsi" w:cstheme="majorHAnsi"/>
                 <w:sz w:val="15"/>
               </w:rPr>
-              <w:t>Seguimiento academico</w:t>
+              <w:t>Seguimiento académico</w:t>
             </w:r>
           </w:p>
         </w:tc>
@@ -3178,7 +3163,7 @@
           <w:rFonts w:asciiTheme="majorHAnsi" w:hAnsiTheme="majorHAnsi" w:cstheme="majorHAnsi"/>
           <w:sz w:val="16"/>
         </w:rPr>
-        <w:t>Contacto autorizado: Vicente Rivera | RUT 21.768.183-9 | Lider backend / Jefe de Proyecto | Ingenieria en Informatica, Duoc UC Plaza Norte</w:t>
+        <w:t>Contacto autorizado: Vicente Rivera | RUT 21.768.183-9 | Líder backend / Jefe de Proyecto (con responsabilidades compartidas con Ignacio Fuenzalida en actividades y entregables) | Ingeniería en Informática, Duoc UC Plaza Norte</w:t>
       </w:r>
     </w:p>
     <w:tbl>
@@ -3352,7 +3337,7 @@
                 <w:rFonts w:asciiTheme="majorHAnsi" w:hAnsiTheme="majorHAnsi" w:cstheme="majorHAnsi"/>
                 <w:sz w:val="16"/>
               </w:rPr>
-              <w:t>Lider backend / Jefe de Proyecto</w:t>
+              <w:t>Líder backend / Jefe de Proyecto (con responsabilidades compartidas con Ignacio Fuenzalida en actividades y entregables)</w:t>
             </w:r>
           </w:p>
         </w:tc>
@@ -3378,7 +3363,7 @@
                 <w:rFonts w:asciiTheme="majorHAnsi" w:hAnsiTheme="majorHAnsi" w:cstheme="majorHAnsi"/>
                 <w:sz w:val="16"/>
               </w:rPr>
-              <w:t>Ingenieria en Informatica, Duoc UC Plaza Norte</w:t>
+              <w:t>Ingeniería en Informática, Duoc UC Plaza Norte</w:t>
             </w:r>
           </w:p>
         </w:tc>
@@ -3569,7 +3554,7 @@
                 <w:rFonts w:asciiTheme="majorHAnsi" w:hAnsiTheme="majorHAnsi" w:cstheme="majorHAnsi"/>
                 <w:sz w:val="15"/>
               </w:rPr>
-              <w:t>No contemplamos contratacion. El equipo esta compuesto por dos personas. Repartiremos el trabajo entre backend y frontend, pero mantendremos compartidas la arquitectura, las pruebas, la documentacion, el control de cambios y la coordinacion.</w:t>
+              <w:t>No contemplamos contratación. El equipo está compuesto por dos personas. Repartiremos el trabajo entre backend y frontend, pero mantendremos compartidas la arquitectura, las pruebas, la documentación, el control de cambios y la coordinación.</w:t>
             </w:r>
           </w:p>
         </w:tc>
@@ -3626,7 +3611,7 @@
                 <w:rFonts w:asciiTheme="majorHAnsi" w:hAnsiTheme="majorHAnsi" w:cstheme="majorHAnsi"/>
                 <w:sz w:val="15"/>
               </w:rPr>
-              <w:t>Controlaremos los costos dentro del alcance academico. Revisaremos entre ambos cualquier gasto nuevo y no comprometeremos infraestructura productiva que quede fuera del presupuesto o de la planificacion del MVP.</w:t>
+              <w:t>Controlaremos los costos dentro del alcance académico. Revisaremos entre ambos cualquier gasto nuevo y no comprometeremos infraestructura productiva que quede fuera del presupuesto o de la planificación del MVP.</w:t>
             </w:r>
           </w:p>
         </w:tc>
@@ -3683,7 +3668,7 @@
                 <w:rFonts w:asciiTheme="majorHAnsi" w:hAnsiTheme="majorHAnsi" w:cstheme="majorHAnsi"/>
                 <w:sz w:val="15"/>
               </w:rPr>
-              <w:t>Distribuiremos las decisiones tecnicas segun nuestras responsabilidades principales. Las decisiones que afecten autenticacion, RLS, persistencia, Webpay, pagos, seguridad o alcance completo las revisaremos y acordaremos entre ambos.</w:t>
+              <w:t>Distribuiremos las decisiones técnicas según nuestras responsabilidades principales. Las decisiones que afecten autenticación, RLS, persistencia, Webpay, pagos, seguridad o alcance completo las revisaremos y acordaremos entre ambos.</w:t>
             </w:r>
           </w:p>
         </w:tc>
@@ -3740,7 +3725,7 @@
                 <w:rFonts w:asciiTheme="majorHAnsi" w:hAnsiTheme="majorHAnsi" w:cstheme="majorHAnsi"/>
                 <w:sz w:val="15"/>
               </w:rPr>
-              <w:t>Cuando exista una diferencia tecnica o de planificacion, nosotros compararemos alternativas segun impacto en tiempo, riesgo, dependencias, calidad y alcance. Buscaremos una decision conjunta y dejaremos registro cuando la decision sea relevante.</w:t>
+              <w:t>Cuando exista una diferencia técnica o de planificación, nosotros compararemos alternativas según impacto en tiempo, riesgo, dependencias, calidad y alcance. Buscaremos una decisión conjunta y dejaremos registro cuando la decisión sea relevante.</w:t>
             </w:r>
           </w:p>
         </w:tc>
@@ -3797,7 +3782,7 @@
                 <w:rFonts w:asciiTheme="majorHAnsi" w:hAnsiTheme="majorHAnsi" w:cstheme="majorHAnsi"/>
                 <w:sz w:val="15"/>
               </w:rPr>
-              <w:t>Primero resolveremos los bloqueos dentro del equipo. Si un problema requiere una decision academica o afecta el alcance comprometido, lo elevaremos al responsable academico de la asignatura. No estamos autorizados a asumir compromisos institucionales, gastos relevantes o funciones fuera del alcance sin la aprobacion correspondiente.</w:t>
+              <w:t>Primero resolveremos los bloqueos dentro del equipo. Si un problema requiere una decisión académica o afecta el alcance comprometido, lo elevaremos al responsable académico de la asignatura. No estamos autorizados a asumir compromisos institucionales, gastos relevantes o funciones fuera del alcance sin la aprobación correspondiente.</w:t>
             </w:r>
           </w:p>
         </w:tc>
@@ -4053,7 +4038,7 @@
                 <w:rFonts w:asciiTheme="majorHAnsi" w:hAnsiTheme="majorHAnsi" w:cstheme="majorHAnsi"/>
                 <w:sz w:val="15"/>
               </w:rPr>
-              <w:t>FastAPI + Python + Docker + Cloud Run para la logica e integraciones que requieran backend propio</w:t>
+              <w:t>FastAPI + Python + Docker + Cloud Run, acotado a la lógica específica de la integración con Webpay (Transbank)</w:t>
             </w:r>
           </w:p>
         </w:tc>
@@ -4133,7 +4118,7 @@
                 <w:rFonts w:asciiTheme="majorHAnsi" w:hAnsiTheme="majorHAnsi" w:cstheme="majorHAnsi"/>
                 <w:sz w:val="15"/>
               </w:rPr>
-              <w:t>Datos y autenticacion / Backend y compartido</w:t>
+              <w:t>Datos y autenticación / Backend y compartido</w:t>
             </w:r>
           </w:p>
         </w:tc>
@@ -4164,7 +4149,7 @@
                 <w:rFonts w:asciiTheme="majorHAnsi" w:hAnsiTheme="majorHAnsi" w:cstheme="majorHAnsi"/>
                 <w:sz w:val="15"/>
               </w:rPr>
-              <w:t>Webpay Mall (Transbank, Split Payment) + Resend SMTP/API + manejo seguro de datos bancarios</w:t>
+              <w:t>Webpay Mall (Transbank, Split Payment) + Resend SMTP/API + políticas de acceso y permisos de almacenamiento para los documentos de postulación</w:t>
             </w:r>
           </w:p>
         </w:tc>

</xml_diff>